<commit_message>
Controle financeiro por bloco: repasse de R$ 150 por PIX em vez do app
Co-Authored-By: Claude Opus 5.5 <noreply@anthropic.com>
Claude-Session: https://claude.ai/code/session_01MBn9YrntdXfTASAVKo9hpN
</commit_message>
<xml_diff>
--- a/entregas/anexo-1-regulamento-acao-arrecadacao.docx
+++ b/entregas/anexo-1-regulamento-acao-arrecadacao.docx
@@ -310,7 +310,7 @@
           <w:b w:val="0"/>
           <w:i w:val="0"/>
         </w:rPr>
-        <w:t>Cada acadêmico vende seus bilhetes de forma independente. A cada venda, preenche o canhoto (nome e telefone do comprador) e registra no mesmo dia, no sistema on-line de vendas do projeto, os números vendidos, os dados do comprador e a forma de pagamento. O sistema é o registro oficial para o sorteio: aceita apenas números do bloco do próprio acadêmico e impede venda duplicada.</w:t>
+        <w:t>Cada acadêmico vende seus bilhetes de forma independente, preenche o canhoto de cada bilhete vendido (nome e telefone do comprador) e recebe o valor diretamente do comprador.</w:t>
       </w:r>
     </w:p>
     <w:p>
@@ -322,7 +322,7 @@
           <w:b w:val="0"/>
           <w:i w:val="0"/>
         </w:rPr>
-        <w:t>O pagamento é feito preferencialmente por PIX, pelo código gerado no sistema (valor exato e identificação do pedido), diretamente na conta de recebimento de uso exclusivo da ação de arrecadação, indicada pela comissão financeira e aprovada pela professora responsável ([PENDENTE: chave PIX da comissão]). Valores em espécie são entregues à comissão nos acertos semanais, às segundas-feiras, nos encontros do projeto.</w:t>
+        <w:t>Até 30/10/2026, às 23h59, cada acadêmico repassa o valor integral do bloco, R$ 150,00, por PIX, à conta de recebimento de uso exclusivo da ação de arrecadação (chave aleatória fe5450d9-8b9e-470e-8b46-0d07e4a86d0d), sob a responsabilidade de Edgar [PENDENTE: nome completo], aprovada pela professora responsável. O repasse deve partir de conta do próprio acadêmico ou trazer seu nome na mensagem do PIX.</w:t>
       </w:r>
     </w:p>
     <w:p>
@@ -334,7 +334,19 @@
           <w:b w:val="0"/>
           <w:i w:val="0"/>
         </w:rPr>
-        <w:t>Prazo final de venda, registro e pagamento: 30/10/2026, às 23h59. Bilhetes não registrados ou não pagos até esse horário não concorrem.</w:t>
+        <w:t>Junto com o repasse, o acadêmico entrega à comissão financeira os 30 canhotos preenchidos. Os bilhetes não vendidos são completados pelo próprio acadêmico, com recursos próprios, e concorrem em seu nome.</w:t>
+      </w:r>
+    </w:p>
+    <w:p>
+      <w:pPr>
+        <w:pStyle w:val="ListBullet"/>
+      </w:pPr>
+      <w:r>
+        <w:rPr>
+          <w:b w:val="0"/>
+          <w:i w:val="0"/>
+        </w:rPr>
+        <w:t>O bloco é considerado quitado quando o repasse de R$ 150,00 é identificado no extrato e os canhotos são conferidos. Somente concorrem os bilhetes de blocos quitados até 30/10/2026, às 23h59. O acadêmico responde, perante os compradores, pelos bilhetes que vendeu.</w:t>
       </w:r>
     </w:p>
     <w:p>
@@ -347,18 +359,6 @@
           <w:i w:val="0"/>
         </w:rPr>
         <w:t>Em 01/11/2026, a lista dos números participantes (sem dados pessoais) é publicada no @efeitorebote.oficial.</w:t>
-      </w:r>
-    </w:p>
-    <w:p>
-      <w:pPr>
-        <w:pStyle w:val="ListBullet"/>
-      </w:pPr>
-      <w:r>
-        <w:rPr>
-          <w:b w:val="0"/>
-          <w:i w:val="0"/>
-        </w:rPr>
-        <w:t>Os canhotos e os bilhetes não vendidos são entregues à comissão financeira no primeiro encontro após o sorteio, para conferência e arquivo.</w:t>
       </w:r>
     </w:p>
     <w:p>
@@ -418,7 +418,7 @@
           <w:b w:val="0"/>
           <w:i w:val="0"/>
         </w:rPr>
-        <w:t>Se o sorteio precisar ser adiado, a nova data será divulgada com antecedência nos canais do projeto. Se a ação de arrecadação for cancelada, o valor pago será integralmente devolvido a cada comprador pela mesma forma de pagamento.</w:t>
+        <w:t>Se o sorteio precisar ser adiado, a nova data será divulgada com antecedência nos canais do projeto. Se a ação de arrecadação for cancelada, a comissão financeira devolverá o valor integral de cada bloco ao respectivo acadêmico, que o restituirá aos compradores.</w:t>
       </w:r>
     </w:p>
     <w:p>
@@ -455,7 +455,7 @@
           <w:b w:val="0"/>
           <w:i w:val="0"/>
         </w:rPr>
-        <w:t>Os valores arrecadados com a ação de arrecadação, deduzido o custo de aquisição do prêmio, serão utilizados exclusivamente na compra dos itens listados no item 2, mediante nota fiscal. A comissão financeira, composta por [PENDENTE: integrantes da comissão financeira], manterá o controle de entradas e saídas. Ao final, será apresentado relatório de transparência à professora responsável e à turma, com o valor arrecadado, os comprovantes de compra e o quantitativo entregue por unidade.</w:t>
+        <w:t>Os valores arrecadados com a ação de arrecadação, deduzido o custo de aquisição do prêmio, serão utilizados exclusivamente na compra dos itens listados no item 2, mediante nota fiscal. A comissão financeira, composta por [PENDENTE: integrantes da comissão financeira], manterá a planilha de controle dos repasses por bloco e das saídas, conferida com o extrato da conta de uso exclusivo. Ao final, será apresentado relatório de transparência à professora responsável e à turma, com o valor arrecadado, os comprovantes de compra e o quantitativo entregue por unidade.</w:t>
       </w:r>
     </w:p>
     <w:p>

</xml_diff>

<commit_message>
Inclui doações em dinheiro na prestação de contas e preenche campos definidos em 06/10
Co-Authored-By: Claude Opus 5.5 <noreply@anthropic.com>
Claude-Session: https://claude.ai/code/session_01MBn9YrntdXfTASAVKo9hpN
</commit_message>
<xml_diff>
--- a/entregas/anexo-1-regulamento-acao-arrecadacao.docx
+++ b/entregas/anexo-1-regulamento-acao-arrecadacao.docx
@@ -322,7 +322,7 @@
           <w:b w:val="0"/>
           <w:i w:val="0"/>
         </w:rPr>
-        <w:t>Até 30/10/2026, às 23h59, cada acadêmico repassa o valor integral do bloco, R$ 150,00, por PIX, à conta de recebimento de uso exclusivo da ação de arrecadação (chave aleatória fe5450d9-8b9e-470e-8b46-0d07e4a86d0d), sob a responsabilidade de Edgar [PENDENTE: nome completo], aprovada pela professora responsável. O repasse deve partir de conta do próprio acadêmico ou trazer seu nome na mensagem do PIX.</w:t>
+        <w:t>Até 30/10/2026, às 23h59, cada acadêmico repassa o valor integral do bloco, R$ 150,00, por PIX, à conta de recebimento de uso exclusivo da ação de arrecadação (chave aleatória fe5450d9-8b9e-470e-8b46-0d07e4a86d0d), sob a responsabilidade de Edgar Gabriel Castro Rocha, titular da conta, aprovada pela professora responsável. O repasse deve partir de conta do próprio acadêmico ou trazer seu nome na mensagem do PIX.</w:t>
       </w:r>
     </w:p>
     <w:p>
@@ -455,7 +455,7 @@
           <w:b w:val="0"/>
           <w:i w:val="0"/>
         </w:rPr>
-        <w:t>Os valores arrecadados com a ação de arrecadação, deduzido o custo de aquisição do prêmio, serão utilizados exclusivamente na compra dos itens listados no item 2, mediante nota fiscal. A comissão financeira, composta por [PENDENTE: integrantes da comissão financeira], manterá a planilha de controle dos repasses por bloco e das saídas, conferida com o extrato da conta de uso exclusivo. Ao final, será apresentado relatório de transparência à professora responsável e à turma, com o valor arrecadado, os comprovantes de compra e o quantitativo entregue por unidade.</w:t>
+        <w:t>Os valores arrecadados com a ação de arrecadação, deduzido o custo de aquisição do prêmio, e as doações em dinheiro recebidas por PIX na mesma conta serão utilizados exclusivamente na compra dos itens listados no item 2, mediante nota fiscal. A comissão financeira, composta por [PENDENTE: integrantes da comissão financeira], manterá a planilha de controle dos repasses por bloco, das doações em dinheiro e das saídas, conferida com o extrato da conta de uso exclusivo. Ao final, será apresentado relatório de transparência à professora responsável e à turma, com o valor arrecadado na ação de arrecadação, o total das doações em dinheiro, os comprovantes de compra e o quantitativo de itens arrecadados e entregue por unidade.</w:t>
       </w:r>
     </w:p>
     <w:p>

</xml_diff>